<commit_message>
implement etl pipeline for material candidates
</commit_message>
<xml_diff>
--- a/docs/Research Paper.docx
+++ b/docs/Research Paper.docx
@@ -2,6 +2,17 @@
 <file path=word/document.xml><?xml version="1.0" encoding="utf-8"?>
 <w:document xmlns:wpc="http://schemas.microsoft.com/office/word/2010/wordprocessingCanvas" xmlns:cx="http://schemas.microsoft.com/office/drawing/2014/chartex" xmlns:cx1="http://schemas.microsoft.com/office/drawing/2015/9/8/chartex" xmlns:cx2="http://schemas.microsoft.com/office/drawing/2015/10/21/chartex" xmlns:cx3="http://schemas.microsoft.com/office/drawing/2016/5/9/chartex" xmlns:cx4="http://schemas.microsoft.com/office/drawing/2016/5/10/chartex" xmlns:cx5="http://schemas.microsoft.com/office/drawing/2016/5/11/chartex" xmlns:cx6="http://schemas.microsoft.com/office/drawing/2016/5/12/chartex" xmlns:cx7="http://schemas.microsoft.com/office/drawing/2016/5/13/chartex" xmlns:cx8="http://schemas.microsoft.com/office/drawing/2016/5/14/chartex" xmlns:mc="http://schemas.openxmlformats.org/markup-compatibility/2006" xmlns:aink="http://schemas.microsoft.com/office/drawing/2016/ink" xmlns:am3d="http://schemas.microsoft.com/office/drawing/2017/model3d" xmlns:o="urn:schemas-microsoft-com:office:office" xmlns:oel="http://schemas.microsoft.com/office/2019/extlst" xmlns:r="http://schemas.openxmlformats.org/officeDocument/2006/relationships" xmlns:m="http://schemas.openxmlformats.org/officeDocument/2006/math" xmlns:v="urn:schemas-microsoft-com:vml" xmlns:wp14="http://schemas.microsoft.com/office/word/2010/wordprocessingDrawing" xmlns:wp="http://schemas.openxmlformats.org/drawingml/2006/wordprocessingDrawing" xmlns:w10="urn:schemas-microsoft-com:office:word" xmlns:w="http://schemas.openxmlformats.org/wordprocessingml/2006/main" xmlns:w14="http://schemas.microsoft.com/office/word/2010/wordml" xmlns:w15="http://schemas.microsoft.com/office/word/2012/wordml" xmlns:w16cex="http://schemas.microsoft.com/office/word/2018/wordml/cex" xmlns:w16cid="http://schemas.microsoft.com/office/word/2016/wordml/cid" xmlns:w16="http://schemas.microsoft.com/office/word/2018/wordml" xmlns:w16du="http://schemas.microsoft.com/office/word/2023/wordml/word16du" xmlns:w16sdtdh="http://schemas.microsoft.com/office/word/2020/wordml/sdtdatahash" xmlns:w16sdtfl="http://schemas.microsoft.com/office/word/2024/wordml/sdtformatlock" xmlns:w16se="http://schemas.microsoft.com/office/word/2015/wordml/symex" xmlns:wpg="http://schemas.microsoft.com/office/word/2010/wordprocessingGroup" xmlns:wpi="http://schemas.microsoft.com/office/word/2010/wordprocessingInk" xmlns:wne="http://schemas.microsoft.com/office/word/2006/wordml" xmlns:wps="http://schemas.microsoft.com/office/word/2010/wordprocessingShape" mc:Ignorable="w14 w15 w16se w16cid w16 w16cex w16sdtdh w16sdtfl w16du wp14">
   <w:body>
+    <w:p>
+      <w:pPr>
+        <w:pStyle w:val="Subtitle"/>
+        <w:jc w:val="center"/>
+        <w:rPr>
+          <w:rFonts w:ascii="Times New Roman" w:hAnsi="Times New Roman" w:cs="Times New Roman"/>
+          <w:b/>
+          <w:sz w:val="24"/>
+        </w:rPr>
+      </w:pPr>
+    </w:p>
     <w:p>
       <w:pPr>
         <w:pStyle w:val="Subtitle"/>
@@ -281,7 +292,6 @@
           <w:sz w:val="40"/>
           <w:szCs w:val="40"/>
         </w:rPr>
-        <w:lastRenderedPageBreak/>
         <w:t>Abstract</w:t>
       </w:r>
     </w:p>
@@ -509,20 +519,14 @@
         <w:divId w:val="2070691876"/>
       </w:pPr>
       <w:r>
+        <w:lastRenderedPageBreak/>
         <w:t xml:space="preserve">The results demonstrate that </w:t>
       </w:r>
       <w:r>
         <w:rPr>
           <w:rStyle w:val="Strong"/>
         </w:rPr>
-        <w:t xml:space="preserve">optimized NFPP-based sodium-ion configurations can achieve improvements in energy density, round-trip efficiency, and thermal stability relative to </w:t>
-      </w:r>
-      <w:r>
-        <w:rPr>
-          <w:rStyle w:val="Strong"/>
-        </w:rPr>
-        <w:lastRenderedPageBreak/>
-        <w:t>conventional NFPP cells</w:t>
+        <w:t>optimized NFPP-based sodium-ion configurations can achieve improvements in energy density, round-trip efficiency, and thermal stability relative to conventional NFPP cells</w:t>
       </w:r>
       <w:r>
         <w:t xml:space="preserve">, while maintaining significant cost advantages due to the elimination of lithium and reduced reliance on critical minerals. These characteristics position the optimized sodium-ion system as a </w:t>
@@ -1056,7 +1060,6 @@
             </m:r>
           </m:e>
           <m:sub>
-            <w:proofErr w:type="gramStart"/>
             <m:r>
               <m:rPr>
                 <m:nor/>
@@ -1068,7 +1071,6 @@
               </w:rPr>
               <m:t>thermal,env</m:t>
             </m:r>
-            <w:proofErr w:type="gramEnd"/>
           </m:sub>
         </m:sSub>
       </m:oMath>
@@ -1116,7 +1118,6 @@
             </m:r>
           </m:e>
           <m:sub>
-            <w:proofErr w:type="gramStart"/>
             <m:r>
               <m:rPr>
                 <m:nor/>
@@ -1128,7 +1129,6 @@
               </w:rPr>
               <m:t>grid,env</m:t>
             </m:r>
-            <w:proofErr w:type="gramEnd"/>
           </m:sub>
         </m:sSub>
       </m:oMath>
@@ -1288,7 +1288,6 @@
             </m:r>
           </m:e>
           <m:sub>
-            <w:proofErr w:type="gramStart"/>
             <m:r>
               <m:rPr>
                 <m:nor/>
@@ -1300,7 +1299,6 @@
               </w:rPr>
               <m:t>cool,LFP</m:t>
             </m:r>
-            <w:proofErr w:type="gramEnd"/>
           </m:sub>
         </m:sSub>
       </m:oMath>
@@ -2883,7 +2881,6 @@
             </m:r>
           </m:e>
           <m:sub>
-            <w:proofErr w:type="gramStart"/>
             <m:r>
               <m:rPr>
                 <m:nor/>
@@ -2895,7 +2892,6 @@
               </w:rPr>
               <m:t>cool,LFP</m:t>
             </m:r>
-            <w:proofErr w:type="gramEnd"/>
           </m:sub>
         </m:sSub>
       </m:oMath>
@@ -2929,7 +2925,6 @@
             </m:r>
           </m:e>
           <m:sub>
-            <w:proofErr w:type="gramStart"/>
             <m:r>
               <m:rPr>
                 <m:nor/>
@@ -2941,7 +2936,6 @@
               </w:rPr>
               <m:t>cool,adj</m:t>
             </m:r>
-            <w:proofErr w:type="gramEnd"/>
           </m:sub>
         </m:sSub>
       </m:oMath>
@@ -3041,7 +3035,6 @@
             </m:r>
           </m:e>
           <m:sub>
-            <w:proofErr w:type="gramStart"/>
             <m:r>
               <m:rPr>
                 <m:nor/>
@@ -3053,7 +3046,6 @@
               </w:rPr>
               <m:t>cool,adj</m:t>
             </m:r>
-            <w:proofErr w:type="gramEnd"/>
           </m:sub>
         </m:sSub>
       </m:oMath>
@@ -4118,7 +4110,6 @@
             </m:r>
           </m:e>
           <m:sub>
-            <w:proofErr w:type="gramStart"/>
             <m:r>
               <m:rPr>
                 <m:nor/>
@@ -4130,7 +4121,6 @@
               </w:rPr>
               <m:t>cool,adj</m:t>
             </m:r>
-            <w:proofErr w:type="gramEnd"/>
           </m:sub>
         </m:sSub>
       </m:oMath>
@@ -5958,7 +5948,6 @@
             </m:r>
           </m:e>
           <m:sub>
-            <w:proofErr w:type="gramStart"/>
             <m:r>
               <m:rPr>
                 <m:nor/>
@@ -5970,7 +5959,6 @@
               </w:rPr>
               <m:t>grid,N</m:t>
             </m:r>
-            <w:proofErr w:type="gramEnd"/>
           </m:sub>
         </m:sSub>
       </m:oMath>
@@ -8825,6 +8813,9 @@
             <m:t>)</m:t>
           </m:r>
           <m:r>
+            <m:rPr>
+              <m:sty m:val="p"/>
+            </m:rPr>
             <w:rPr>
               <w:rFonts w:eastAsia="Times New Roman"/>
               <w:lang w:val="en-NG"/>
@@ -9580,6 +9571,9 @@
             <m:t>)</m:t>
           </m:r>
           <m:r>
+            <m:rPr>
+              <m:sty m:val="p"/>
+            </m:rPr>
             <w:rPr>
               <w:rFonts w:eastAsia="Times New Roman"/>
               <w:lang w:val="en-NG"/>
@@ -9759,6 +9753,9 @@
             <m:t>(t)&gt;0}</m:t>
           </m:r>
           <m:r>
+            <m:rPr>
+              <m:sty m:val="p"/>
+            </m:rPr>
             <w:rPr>
               <w:rFonts w:eastAsia="Times New Roman"/>
               <w:lang w:val="en-NG"/>
@@ -9867,6 +9864,9 @@
             <m:t>C</m:t>
           </m:r>
           <m:r>
+            <m:rPr>
+              <m:sty m:val="p"/>
+            </m:rPr>
             <w:rPr>
               <w:rFonts w:eastAsia="Times New Roman"/>
               <w:lang w:val="en-NG"/>
@@ -10516,6 +10516,9 @@
             <m:t>W</m:t>
           </m:r>
           <m:r>
+            <m:rPr>
+              <m:sty m:val="p"/>
+            </m:rPr>
             <w:rPr>
               <w:rFonts w:eastAsia="Times New Roman"/>
               <w:lang w:val="en-NG"/>
@@ -11267,6 +11270,9 @@
             <m:t>)</m:t>
           </m:r>
           <m:r>
+            <m:rPr>
+              <m:sty m:val="p"/>
+            </m:rPr>
             <w:rPr>
               <w:rFonts w:eastAsia="Times New Roman"/>
               <w:lang w:val="en-NG"/>
@@ -12275,6 +12281,9 @@
             <m:t>&gt;0)</m:t>
           </m:r>
           <m:r>
+            <m:rPr>
+              <m:sty m:val="p"/>
+            </m:rPr>
             <w:rPr>
               <w:rFonts w:eastAsia="Times New Roman"/>
               <w:lang w:val="en-NG"/>
@@ -12568,6 +12577,9 @@
             <m:t>)</m:t>
           </m:r>
           <m:r>
+            <m:rPr>
+              <m:sty m:val="p"/>
+            </m:rPr>
             <w:rPr>
               <w:rFonts w:eastAsia="Times New Roman"/>
               <w:lang w:val="en-NG"/>
@@ -14445,6 +14457,9 @@
             <m:t>=48×950</m:t>
           </m:r>
           <m:r>
+            <m:rPr>
+              <m:sty m:val="p"/>
+            </m:rPr>
             <w:rPr>
               <w:rFonts w:eastAsia="Times New Roman"/>
               <w:lang w:val="en-NG"/>
@@ -14745,6 +14760,9 @@
             <m:t>W</m:t>
           </m:r>
           <m:r>
+            <m:rPr>
+              <m:sty m:val="p"/>
+            </m:rPr>
             <w:rPr>
               <w:rFonts w:eastAsia="Times New Roman"/>
               <w:lang w:val="en-NG"/>
@@ -15049,6 +15067,9 @@
             <m:t>K</m:t>
           </m:r>
           <m:r>
+            <m:rPr>
+              <m:sty m:val="p"/>
+            </m:rPr>
             <w:rPr>
               <w:rFonts w:eastAsia="Times New Roman"/>
               <w:lang w:val="en-NG"/>
@@ -16382,6 +16403,9 @@
             <m:t>C</m:t>
           </m:r>
           <m:r>
+            <m:rPr>
+              <m:sty m:val="p"/>
+            </m:rPr>
             <w:rPr>
               <w:rFonts w:eastAsia="Times New Roman"/>
               <w:lang w:val="en-NG"/>
@@ -16996,6 +17020,9 @@
             <m:t>hotspot</m:t>
           </m:r>
           <m:r>
+            <m:rPr>
+              <m:sty m:val="p"/>
+            </m:rPr>
             <w:rPr>
               <w:rFonts w:eastAsia="Times New Roman"/>
               <w:lang w:val="en-NG"/>
@@ -18113,7 +18140,7 @@
           <w:lang w:val="en-NG"/>
         </w:rPr>
         <w:pict w14:anchorId="1A92ADA8">
-          <v:rect id="_x0000_i1231" style="width:0;height:1.5pt" o:hralign="center" o:hrstd="t" o:hr="t" fillcolor="#a0a0a0" stroked="f"/>
+          <v:rect id="_x0000_i1057" style="width:0;height:1.5pt" o:hralign="center" o:hrstd="t" o:hr="t" fillcolor="#a0a0a0" stroked="f"/>
         </w:pict>
       </w:r>
     </w:p>
@@ -18340,7 +18367,6 @@
             </m:r>
           </m:e>
           <m:sub>
-            <w:proofErr w:type="gramStart"/>
             <m:r>
               <m:rPr>
                 <m:nor/>
@@ -18351,7 +18377,6 @@
               </w:rPr>
               <m:t>grid,env</m:t>
             </m:r>
-            <w:proofErr w:type="gramEnd"/>
           </m:sub>
         </m:sSub>
       </m:oMath>
@@ -18404,6 +18429,9 @@
             <m:t xml:space="preserve"> outages/year</m:t>
           </m:r>
           <m:r>
+            <m:rPr>
+              <m:sty m:val="p"/>
+            </m:rPr>
             <w:rPr>
               <w:rFonts w:eastAsia="Times New Roman"/>
               <w:lang w:val="en-NG"/>
@@ -18450,6 +18478,9 @@
             <m:t xml:space="preserve"> hours</m:t>
           </m:r>
           <m:r>
+            <m:rPr>
+              <m:sty m:val="p"/>
+            </m:rPr>
             <w:rPr>
               <w:rFonts w:eastAsia="Times New Roman"/>
               <w:lang w:val="en-NG"/>
@@ -18491,7 +18522,7 @@
           <w:lang w:val="en-NG"/>
         </w:rPr>
         <w:pict w14:anchorId="081CBBC2">
-          <v:rect id="_x0000_i1232" style="width:0;height:1.5pt" o:hralign="center" o:hrstd="t" o:hr="t" fillcolor="#a0a0a0" stroked="f"/>
+          <v:rect id="_x0000_i1058" style="width:0;height:1.5pt" o:hralign="center" o:hrstd="t" o:hr="t" fillcolor="#a0a0a0" stroked="f"/>
         </w:pict>
       </w:r>
     </w:p>
@@ -18891,7 +18922,6 @@
           <m:r>
             <w:rPr>
               <w:rFonts w:eastAsia="Times New Roman"/>
-              <w:i/>
               <w:lang w:val="en-NG"/>
             </w:rPr>
             <w:br/>
@@ -18987,7 +19017,6 @@
           <m:r>
             <w:rPr>
               <w:rFonts w:eastAsia="Times New Roman"/>
-              <w:i/>
               <w:lang w:val="en-NG"/>
             </w:rPr>
             <w:br/>
@@ -19010,7 +19039,7 @@
           <w:lang w:val="en-NG"/>
         </w:rPr>
         <w:pict w14:anchorId="515BBE05">
-          <v:rect id="_x0000_i1233" style="width:0;height:1.5pt" o:hralign="center" o:hrstd="t" o:hr="t" fillcolor="#a0a0a0" stroked="f"/>
+          <v:rect id="_x0000_i1059" style="width:0;height:1.5pt" o:hralign="center" o:hrstd="t" o:hr="t" fillcolor="#a0a0a0" stroked="f"/>
         </w:pict>
       </w:r>
     </w:p>
@@ -19246,6 +19275,9 @@
             </m:sub>
           </m:sSub>
           <m:r>
+            <m:rPr>
+              <m:sty m:val="p"/>
+            </m:rPr>
             <w:rPr>
               <w:rFonts w:eastAsia="Times New Roman"/>
               <w:lang w:val="en-NG"/>
@@ -19501,7 +19533,6 @@
           <m:r>
             <w:rPr>
               <w:rFonts w:eastAsia="Times New Roman"/>
-              <w:i/>
               <w:lang w:val="en-NG"/>
             </w:rPr>
             <w:br/>
@@ -19610,7 +19641,6 @@
           <m:r>
             <w:rPr>
               <w:rFonts w:eastAsia="Times New Roman"/>
-              <w:i/>
               <w:lang w:val="en-NG"/>
             </w:rPr>
             <w:br/>
@@ -19633,7 +19663,7 @@
           <w:lang w:val="en-NG"/>
         </w:rPr>
         <w:pict w14:anchorId="479596AA">
-          <v:rect id="_x0000_i1234" style="width:0;height:1.5pt" o:hralign="center" o:hrstd="t" o:hr="t" fillcolor="#a0a0a0" stroked="f"/>
+          <v:rect id="_x0000_i1060" style="width:0;height:1.5pt" o:hralign="center" o:hrstd="t" o:hr="t" fillcolor="#a0a0a0" stroked="f"/>
         </w:pict>
       </w:r>
     </w:p>
@@ -19691,7 +19721,6 @@
             </m:r>
           </m:e>
           <m:sub>
-            <w:proofErr w:type="gramStart"/>
             <m:r>
               <m:rPr>
                 <m:nor/>
@@ -19704,7 +19733,6 @@
               </w:rPr>
               <m:t>grid,env</m:t>
             </m:r>
-            <w:proofErr w:type="gramEnd"/>
           </m:sub>
         </m:sSub>
       </m:oMath>
@@ -20000,6 +20028,9 @@
             </m:den>
           </m:f>
           <m:r>
+            <m:rPr>
+              <m:sty m:val="p"/>
+            </m:rPr>
             <w:rPr>
               <w:rFonts w:eastAsia="Times New Roman"/>
               <w:lang w:val="en-NG"/>
@@ -20107,7 +20138,6 @@
           <m:r>
             <w:rPr>
               <w:rFonts w:eastAsia="Times New Roman"/>
-              <w:i/>
               <w:lang w:val="en-NG"/>
             </w:rPr>
             <w:br/>
@@ -20130,7 +20160,7 @@
           <w:lang w:val="en-NG"/>
         </w:rPr>
         <w:pict w14:anchorId="50C1D139">
-          <v:rect id="_x0000_i1235" style="width:0;height:1.5pt" o:hralign="center" o:hrstd="t" o:hr="t" fillcolor="#a0a0a0" stroked="f"/>
+          <v:rect id="_x0000_i1061" style="width:0;height:1.5pt" o:hralign="center" o:hrstd="t" o:hr="t" fillcolor="#a0a0a0" stroked="f"/>
         </w:pict>
       </w:r>
     </w:p>
@@ -27176,6 +27206,7 @@
   <w:style w:type="character" w:default="1" w:styleId="DefaultParagraphFont">
     <w:name w:val="Default Paragraph Font"/>
     <w:uiPriority w:val="1"/>
+    <w:semiHidden/>
     <w:unhideWhenUsed/>
   </w:style>
   <w:style w:type="table" w:default="1" w:styleId="TableNormal">

</xml_diff>

<commit_message>
feature: remove smart active cooling in favor of cut off temperature thermal control
</commit_message>
<xml_diff>
--- a/docs/Research Paper.docx
+++ b/docs/Research Paper.docx
@@ -211,21 +211,12 @@
           <w:b/>
         </w:rPr>
       </w:pPr>
-      <w:proofErr w:type="gramStart"/>
       <w:r>
         <w:rPr>
           <w:rFonts w:ascii="Times New Roman" w:hAnsi="Times New Roman" w:cs="Times New Roman"/>
           <w:b/>
         </w:rPr>
-        <w:t>MARCH,</w:t>
-      </w:r>
-      <w:proofErr w:type="gramEnd"/>
-      <w:r>
-        <w:rPr>
-          <w:rFonts w:ascii="Times New Roman" w:hAnsi="Times New Roman" w:cs="Times New Roman"/>
-          <w:b/>
-        </w:rPr>
-        <w:t xml:space="preserve"> 2026</w:t>
+        <w:t>MARCH, 2026</w:t>
       </w:r>
     </w:p>
     <w:p>
@@ -310,15 +301,7 @@
         <w:t>cell-level optimization and system-aware performance evaluation of sodium-ion battery technology for stationary energy storage under equatorial grid conditions</w:t>
       </w:r>
       <w:r>
-        <w:t xml:space="preserve">, with </w:t>
-      </w:r>
-      <w:proofErr w:type="gramStart"/>
-      <w:r>
-        <w:t>particular relevance</w:t>
-      </w:r>
-      <w:proofErr w:type="gramEnd"/>
-      <w:r>
-        <w:t xml:space="preserve"> to regions experiencing high climate variability and grid instability. The baseline chemistry considered is a </w:t>
+        <w:t xml:space="preserve">, with particular relevance to regions experiencing high climate variability and grid instability. The baseline chemistry considered is a </w:t>
       </w:r>
       <w:r>
         <w:rPr>
@@ -374,15 +357,7 @@
         <w:t>identify optimized sodium-ion cell configurations capable of outperforming the conventional NFPP–hard carbon baseline while remaining economically viable for large-scale grid storage</w:t>
       </w:r>
       <w:r>
-        <w:t xml:space="preserve">. </w:t>
-      </w:r>
-      <w:proofErr w:type="gramStart"/>
-      <w:r>
-        <w:t>Particular emphasis</w:t>
-      </w:r>
-      <w:proofErr w:type="gramEnd"/>
-      <w:r>
-        <w:t xml:space="preserve"> is placed on resilience to </w:t>
+        <w:t xml:space="preserve">. Particular emphasis is placed on resilience to </w:t>
       </w:r>
       <w:r>
         <w:rPr>
@@ -424,15 +399,7 @@
         <w:t>machine-learning-guided computational framework</w:t>
       </w:r>
       <w:r>
-        <w:t xml:space="preserve"> is employed to explore optimized variations in cathode composition, anode structure, electrolyte formulation, and cell architecture derived from the NFPP–hard carbon baseline. Candidate chemistries are first generated within a constrained sodium-ion materials space compatible with hard carbon </w:t>
-      </w:r>
-      <w:proofErr w:type="gramStart"/>
-      <w:r>
-        <w:t>anodes</w:t>
-      </w:r>
-      <w:proofErr w:type="gramEnd"/>
-      <w:r>
-        <w:t xml:space="preserve"> and existing manufacturing architectures. These candidates are then screened using electrochemical feasibility rules, thermodynamic stability filters, and </w:t>
+        <w:t xml:space="preserve"> is employed to explore optimized variations in cathode composition, anode structure, electrolyte formulation, and cell architecture derived from the NFPP–hard carbon baseline. Candidate chemistries are first generated within a constrained sodium-ion materials space compatible with hard carbon anodes and existing manufacturing architectures. These candidates are then screened using electrochemical feasibility rules, thermodynamic stability filters, and </w:t>
       </w:r>
       <w:r>
         <w:rPr>
@@ -5087,25 +5054,7 @@
           <w:kern w:val="0"/>
           <w14:ligatures w14:val="none"/>
         </w:rPr>
-        <w:t xml:space="preserve">Simulate thermal </w:t>
-      </w:r>
-      <w:proofErr w:type="gramStart"/>
-      <w:r>
-        <w:rPr>
-          <w:rFonts w:ascii="Times New Roman" w:eastAsia="Times New Roman" w:hAnsi="Times New Roman" w:cs="Times New Roman"/>
-          <w:kern w:val="0"/>
-          <w14:ligatures w14:val="none"/>
-        </w:rPr>
-        <w:t>response</w:t>
-      </w:r>
-      <w:proofErr w:type="gramEnd"/>
-      <w:r>
-        <w:rPr>
-          <w:rFonts w:ascii="Times New Roman" w:eastAsia="Times New Roman" w:hAnsi="Times New Roman" w:cs="Times New Roman"/>
-          <w:kern w:val="0"/>
-          <w14:ligatures w14:val="none"/>
-        </w:rPr>
-        <w:t xml:space="preserve"> under:</w:t>
+        <w:t>Simulate thermal response under:</w:t>
       </w:r>
     </w:p>
     <w:p>
@@ -9365,7 +9314,25 @@
           <w:bCs/>
           <w:lang w:val="en-NG"/>
         </w:rPr>
-        <w:t xml:space="preserve">4) Cooling Activation Threshold </w:t>
+        <w:t>4) C</w:t>
+      </w:r>
+      <w:r>
+        <w:rPr>
+          <w:rFonts w:eastAsia="Times New Roman"/>
+          <w:b/>
+          <w:bCs/>
+          <w:lang w:val="en-NG"/>
+        </w:rPr>
+        <w:t>ut Off</w:t>
+      </w:r>
+      <w:r>
+        <w:rPr>
+          <w:rFonts w:eastAsia="Times New Roman"/>
+          <w:b/>
+          <w:bCs/>
+          <w:lang w:val="en-NG"/>
+        </w:rPr>
+        <w:t xml:space="preserve"> Threshold </w:t>
       </w:r>
       <m:oMath>
         <m:sSub>
@@ -9455,15 +9422,13 @@
         </w:rPr>
         <w:t xml:space="preserve">It is estimated from measured pack </w:t>
       </w:r>
-      <w:proofErr w:type="spellStart"/>
-      <w:r>
-        <w:rPr>
-          <w:rFonts w:eastAsia="Times New Roman"/>
-          <w:lang w:val="en-NG"/>
-        </w:rPr>
-        <w:t>behavior</w:t>
-      </w:r>
-      <w:proofErr w:type="spellEnd"/>
+      <w:r>
+        <w:rPr>
+          <w:rFonts w:eastAsia="Times New Roman"/>
+          <w:lang w:val="en-NG"/>
+        </w:rPr>
+        <w:t>behaviour</w:t>
+      </w:r>
       <w:r>
         <w:rPr>
           <w:rFonts w:eastAsia="Times New Roman"/>
@@ -9486,172 +9451,21 @@
           <w:rFonts w:eastAsia="Times New Roman"/>
           <w:lang w:val="en-NG"/>
         </w:rPr>
-        <w:t>Use cooling log / fan activation log:</w:t>
-      </w:r>
-    </w:p>
-    <w:p>
-      <w:pPr>
-        <w:spacing w:before="100" w:beforeAutospacing="1" w:after="100" w:afterAutospacing="1" w:line="240" w:lineRule="auto"/>
-        <w:outlineLvl w:val="0"/>
-        <w:rPr>
-          <w:rFonts w:eastAsia="Times New Roman"/>
-          <w:lang w:val="en-NG"/>
-        </w:rPr>
-      </w:pPr>
-      <m:oMathPara>
-        <m:oMath>
-          <m:sSub>
-            <m:sSubPr>
-              <m:ctrlPr>
-                <w:rPr>
-                  <w:rFonts w:ascii="Cambria Math" w:eastAsia="Times New Roman" w:hAnsi="Cambria Math"/>
-                  <w:lang w:val="en-NG"/>
-                </w:rPr>
-              </m:ctrlPr>
-            </m:sSubPr>
-            <m:e>
-              <m:r>
-                <w:rPr>
-                  <w:rFonts w:ascii="Cambria Math" w:eastAsia="Times New Roman" w:hAnsi="Cambria Math"/>
-                  <w:lang w:val="en-NG"/>
-                </w:rPr>
-                <m:t>T</m:t>
-              </m:r>
-            </m:e>
-            <m:sub>
-              <m:r>
-                <w:rPr>
-                  <w:rFonts w:ascii="Cambria Math" w:eastAsia="Times New Roman" w:hAnsi="Cambria Math"/>
-                  <w:lang w:val="en-NG"/>
-                </w:rPr>
-                <m:t>cool,LFP</m:t>
-              </m:r>
-            </m:sub>
-          </m:sSub>
-          <m:r>
-            <w:rPr>
-              <w:rFonts w:ascii="Cambria Math" w:eastAsia="Times New Roman" w:hAnsi="Cambria Math"/>
-              <w:lang w:val="en-NG"/>
-            </w:rPr>
-            <m:t>=T(</m:t>
-          </m:r>
-          <m:sSub>
-            <m:sSubPr>
-              <m:ctrlPr>
-                <w:rPr>
-                  <w:rFonts w:ascii="Cambria Math" w:eastAsia="Times New Roman" w:hAnsi="Cambria Math"/>
-                  <w:lang w:val="en-NG"/>
-                </w:rPr>
-              </m:ctrlPr>
-            </m:sSubPr>
-            <m:e>
-              <m:r>
-                <w:rPr>
-                  <w:rFonts w:ascii="Cambria Math" w:eastAsia="Times New Roman" w:hAnsi="Cambria Math"/>
-                  <w:lang w:val="en-NG"/>
-                </w:rPr>
-                <m:t>t</m:t>
-              </m:r>
-            </m:e>
-            <m:sub>
-              <m:r>
-                <w:rPr>
-                  <w:rFonts w:ascii="Cambria Math" w:eastAsia="Times New Roman" w:hAnsi="Cambria Math"/>
-                  <w:lang w:val="en-NG"/>
-                </w:rPr>
-                <m:t>k</m:t>
-              </m:r>
-            </m:sub>
-          </m:sSub>
-          <m:r>
-            <w:rPr>
-              <w:rFonts w:ascii="Cambria Math" w:eastAsia="Times New Roman" w:hAnsi="Cambria Math"/>
-              <w:lang w:val="en-NG"/>
-            </w:rPr>
-            <m:t>)</m:t>
-          </m:r>
-          <m:r>
-            <m:rPr>
-              <m:sty m:val="p"/>
-            </m:rPr>
-            <w:rPr>
-              <w:rFonts w:eastAsia="Times New Roman"/>
-              <w:lang w:val="en-NG"/>
-            </w:rPr>
-            <w:br/>
-          </m:r>
-        </m:oMath>
-      </m:oMathPara>
-    </w:p>
-    <w:p>
-      <w:pPr>
-        <w:spacing w:before="100" w:beforeAutospacing="1" w:after="100" w:afterAutospacing="1" w:line="240" w:lineRule="auto"/>
-        <w:outlineLvl w:val="0"/>
-        <w:rPr>
-          <w:rFonts w:eastAsia="Times New Roman"/>
-          <w:lang w:val="en-NG"/>
-        </w:rPr>
-      </w:pPr>
-      <w:r>
-        <w:rPr>
-          <w:rFonts w:eastAsia="Times New Roman"/>
-          <w:lang w:val="en-NG"/>
-        </w:rPr>
-        <w:t xml:space="preserve">where </w:t>
-      </w:r>
-      <m:oMath>
-        <m:sSub>
-          <m:sSubPr>
-            <m:ctrlPr>
-              <w:rPr>
-                <w:rFonts w:ascii="Cambria Math" w:eastAsia="Times New Roman" w:hAnsi="Cambria Math"/>
-                <w:lang w:val="en-NG"/>
-              </w:rPr>
-            </m:ctrlPr>
-          </m:sSubPr>
-          <m:e>
-            <m:r>
-              <w:rPr>
-                <w:rFonts w:ascii="Cambria Math" w:eastAsia="Times New Roman" w:hAnsi="Cambria Math"/>
-                <w:lang w:val="en-NG"/>
-              </w:rPr>
-              <m:t>t</m:t>
-            </m:r>
-          </m:e>
-          <m:sub>
-            <m:r>
-              <w:rPr>
-                <w:rFonts w:ascii="Cambria Math" w:eastAsia="Times New Roman" w:hAnsi="Cambria Math"/>
-                <w:lang w:val="en-NG"/>
-              </w:rPr>
-              <m:t>k</m:t>
-            </m:r>
-          </m:sub>
-        </m:sSub>
-      </m:oMath>
-      <w:r>
-        <w:rPr>
-          <w:rFonts w:eastAsia="Times New Roman"/>
-          <w:lang w:val="en-NG"/>
-        </w:rPr>
-        <w:t>is first time cooling system activates.</w:t>
-      </w:r>
-    </w:p>
-    <w:p>
-      <w:pPr>
-        <w:spacing w:before="100" w:beforeAutospacing="1" w:after="100" w:afterAutospacing="1" w:line="240" w:lineRule="auto"/>
-        <w:outlineLvl w:val="0"/>
-        <w:rPr>
-          <w:rFonts w:eastAsia="Times New Roman"/>
-          <w:lang w:val="en-NG"/>
-        </w:rPr>
-      </w:pPr>
-      <w:r>
-        <w:rPr>
-          <w:rFonts w:eastAsia="Times New Roman"/>
-          <w:lang w:val="en-NG"/>
-        </w:rPr>
-        <w:t>Formally:</w:t>
+        <w:t>Use</w:t>
+      </w:r>
+      <w:r>
+        <w:rPr>
+          <w:rFonts w:eastAsia="Times New Roman"/>
+          <w:lang w:val="en-NG"/>
+        </w:rPr>
+        <w:t xml:space="preserve"> cut off control</w:t>
+      </w:r>
+      <w:r>
+        <w:rPr>
+          <w:rFonts w:eastAsia="Times New Roman"/>
+          <w:lang w:val="en-NG"/>
+        </w:rPr>
+        <w:t>:</w:t>
       </w:r>
     </w:p>
     <w:p>
@@ -9808,7 +9622,14 @@
                   <w:rFonts w:ascii="Cambria Math" w:eastAsia="Times New Roman" w:hAnsi="Cambria Math"/>
                   <w:lang w:val="en-NG"/>
                 </w:rPr>
-                <m:t>35</m:t>
+                <m:t>6</m:t>
+              </m:r>
+              <m:r>
+                <w:rPr>
+                  <w:rFonts w:ascii="Cambria Math" w:eastAsia="Times New Roman" w:hAnsi="Cambria Math"/>
+                  <w:lang w:val="en-NG"/>
+                </w:rPr>
+                <m:t>5</m:t>
               </m:r>
             </m:e>
             <m:sup>
@@ -9843,7 +9664,14 @@
                   <w:rFonts w:ascii="Cambria Math" w:eastAsia="Times New Roman" w:hAnsi="Cambria Math"/>
                   <w:lang w:val="en-NG"/>
                 </w:rPr>
-                <m:t>40</m:t>
+                <m:t>7</m:t>
+              </m:r>
+              <m:r>
+                <w:rPr>
+                  <w:rFonts w:ascii="Cambria Math" w:eastAsia="Times New Roman" w:hAnsi="Cambria Math"/>
+                  <w:lang w:val="en-NG"/>
+                </w:rPr>
+                <m:t>0</m:t>
               </m:r>
             </m:e>
             <m:sup>
@@ -10495,7 +10323,6 @@
               <w:rFonts w:ascii="Cambria Math" w:eastAsia="Times New Roman" w:hAnsi="Cambria Math"/>
               <w:lang w:val="en-NG"/>
             </w:rPr>
-            <w:lastRenderedPageBreak/>
             <m:t>K</m:t>
           </m:r>
           <m:r>
@@ -10637,6 +10464,7 @@
           <w:rFonts w:eastAsia="Times New Roman"/>
           <w:lang w:val="en-NG"/>
         </w:rPr>
+        <w:lastRenderedPageBreak/>
         <w:t xml:space="preserve">This should be a </w:t>
       </w:r>
       <w:r>
@@ -10948,7 +10776,14 @@
                 <w:rFonts w:ascii="Cambria Math" w:eastAsia="Times New Roman" w:hAnsi="Cambria Math"/>
                 <w:lang w:val="en-NG"/>
               </w:rPr>
-              <m:t>25</m:t>
+              <m:t>4</m:t>
+            </m:r>
+            <m:r>
+              <w:rPr>
+                <w:rFonts w:ascii="Cambria Math" w:eastAsia="Times New Roman" w:hAnsi="Cambria Math"/>
+                <w:lang w:val="en-NG"/>
+              </w:rPr>
+              <m:t>5</m:t>
             </m:r>
           </m:e>
           <m:sup>
@@ -11622,7 +11457,6 @@
           <w:rFonts w:eastAsia="Times New Roman"/>
           <w:lang w:val="en-NG"/>
         </w:rPr>
-        <w:lastRenderedPageBreak/>
         <w:t>Then:</w:t>
       </w:r>
     </w:p>
@@ -11800,6 +11634,7 @@
           <w:rFonts w:eastAsia="Times New Roman"/>
           <w:lang w:val="en-NG"/>
         </w:rPr>
+        <w:lastRenderedPageBreak/>
         <w:t>Where:</w:t>
       </w:r>
     </w:p>
@@ -12878,7 +12713,6 @@
           <w:bCs/>
           <w:lang w:val="en-NG"/>
         </w:rPr>
-        <w:lastRenderedPageBreak/>
         <w:t>1) Electrical Specification (Locked)</w:t>
       </w:r>
     </w:p>
@@ -12944,6 +12778,7 @@
                 <w:bCs/>
                 <w:lang w:val="en-NG"/>
               </w:rPr>
+              <w:lastRenderedPageBreak/>
               <w:t>Parameter</w:t>
             </w:r>
           </w:p>
@@ -14058,6 +13893,7 @@
           <w:bCs/>
           <w:lang w:val="en-NG"/>
         </w:rPr>
+        <w:lastRenderedPageBreak/>
         <w:t>Specific Heat Capacity</w:t>
       </w:r>
     </w:p>
@@ -14786,7 +14622,6 @@
           <w:rFonts w:eastAsia="Times New Roman"/>
           <w:lang w:val="en-NG"/>
         </w:rPr>
-        <w:lastRenderedPageBreak/>
         <w:t>We lock:</w:t>
       </w:r>
     </w:p>
@@ -14909,6 +14744,7 @@
           <w:rFonts w:eastAsia="Times New Roman"/>
           <w:lang w:val="en-NG"/>
         </w:rPr>
+        <w:lastRenderedPageBreak/>
         <w:t>This is realistic for passive residential ESS enclosures.</w:t>
       </w:r>
     </w:p>
@@ -15388,32 +15224,6 @@
           <w:lang w:val="en-NG"/>
         </w:rPr>
       </w:pPr>
-      <w:r>
-        <w:rPr>
-          <w:rFonts w:eastAsia="Times New Roman"/>
-          <w:lang w:val="en-NG"/>
-        </w:rPr>
-        <w:t>These values are realistic and defensible.</w:t>
-      </w:r>
-    </w:p>
-    <w:p>
-      <w:pPr>
-        <w:spacing w:before="100" w:beforeAutospacing="1" w:after="100" w:afterAutospacing="1" w:line="240" w:lineRule="auto"/>
-        <w:outlineLvl w:val="0"/>
-        <w:rPr>
-          <w:rFonts w:eastAsia="Times New Roman"/>
-          <w:lang w:val="en-NG"/>
-        </w:rPr>
-      </w:pPr>
-      <w:r>
-        <w:rPr>
-          <w:rFonts w:eastAsia="Times New Roman"/>
-          <w:lang w:val="en-NG"/>
-        </w:rPr>
-        <w:pict w14:anchorId="1434C1F7">
-          <v:rect id="_x0000_i1043" style="width:0;height:1.5pt" o:hralign="center" o:hrstd="t" o:hr="t" fillcolor="#a0a0a0" stroked="f"/>
-        </w:pict>
-      </w:r>
     </w:p>
     <w:p>
       <w:pPr>
@@ -15433,7 +15243,7 @@
           <w:bCs/>
           <w:lang w:val="en-NG"/>
         </w:rPr>
-        <w:t>3) Cooling System (More Ingenious Than Fan)</w:t>
+        <w:t xml:space="preserve">3) Cooling System </w:t>
       </w:r>
     </w:p>
     <w:p>
@@ -15450,88 +15260,40 @@
           <w:rFonts w:eastAsia="Times New Roman"/>
           <w:lang w:val="en-NG"/>
         </w:rPr>
-        <w:t>Excellent point.</w:t>
+        <w:pict w14:anchorId="4701DB2D">
+          <v:rect id="_x0000_i1065" style="width:0;height:1.5pt" o:hralign="center" o:hrstd="t" o:hr="t" fillcolor="#a0a0a0" stroked="f"/>
+        </w:pict>
       </w:r>
     </w:p>
     <w:p>
       <w:pPr>
         <w:spacing w:before="100" w:beforeAutospacing="1" w:after="100" w:afterAutospacing="1" w:line="240" w:lineRule="auto"/>
         <w:outlineLvl w:val="0"/>
-        <w:rPr>
-          <w:rFonts w:eastAsia="Times New Roman"/>
-          <w:lang w:val="en-NG"/>
-        </w:rPr>
-      </w:pPr>
-      <w:r>
-        <w:rPr>
-          <w:rFonts w:eastAsia="Times New Roman"/>
-          <w:lang w:val="en-NG"/>
-        </w:rPr>
-        <w:t>A plain fan is too simplistic.</w:t>
-      </w:r>
-    </w:p>
-    <w:p>
-      <w:pPr>
-        <w:spacing w:before="100" w:beforeAutospacing="1" w:after="100" w:afterAutospacing="1" w:line="240" w:lineRule="auto"/>
-        <w:outlineLvl w:val="0"/>
-        <w:rPr>
-          <w:rFonts w:eastAsia="Times New Roman"/>
-          <w:lang w:val="en-NG"/>
-        </w:rPr>
-      </w:pPr>
-      <w:r>
-        <w:rPr>
-          <w:rFonts w:eastAsia="Times New Roman"/>
-          <w:lang w:val="en-NG"/>
-        </w:rPr>
-        <w:t xml:space="preserve">For your use case, a </w:t>
-      </w:r>
-      <w:r>
         <w:rPr>
           <w:rFonts w:eastAsia="Times New Roman"/>
           <w:b/>
           <w:bCs/>
           <w:lang w:val="en-NG"/>
         </w:rPr>
-        <w:t>hybrid passive-smart cooling system</w:t>
-      </w:r>
-      <w:r>
-        <w:rPr>
-          <w:rFonts w:eastAsia="Times New Roman"/>
-          <w:lang w:val="en-NG"/>
-        </w:rPr>
-        <w:t xml:space="preserve"> is much better.</w:t>
-      </w:r>
-    </w:p>
-    <w:p>
-      <w:pPr>
-        <w:spacing w:before="100" w:beforeAutospacing="1" w:after="100" w:afterAutospacing="1" w:line="240" w:lineRule="auto"/>
-        <w:outlineLvl w:val="0"/>
-        <w:rPr>
-          <w:rFonts w:eastAsia="Times New Roman"/>
-          <w:lang w:val="en-NG"/>
-        </w:rPr>
-      </w:pPr>
-      <w:r>
-        <w:rPr>
-          <w:rFonts w:eastAsia="Times New Roman"/>
-          <w:lang w:val="en-NG"/>
-        </w:rPr>
-        <w:pict w14:anchorId="4701DB2D">
-          <v:rect id="_x0000_i1044" style="width:0;height:1.5pt" o:hralign="center" o:hrstd="t" o:hr="t" fillcolor="#a0a0a0" stroked="f"/>
-        </w:pict>
-      </w:r>
-    </w:p>
-    <w:p>
-      <w:pPr>
-        <w:spacing w:before="100" w:beforeAutospacing="1" w:after="100" w:afterAutospacing="1" w:line="240" w:lineRule="auto"/>
-        <w:outlineLvl w:val="0"/>
+      </w:pPr>
+      <w:r>
         <w:rPr>
           <w:rFonts w:eastAsia="Times New Roman"/>
           <w:b/>
           <w:bCs/>
           <w:lang w:val="en-NG"/>
         </w:rPr>
+        <w:t>Cooling Architecture</w:t>
+      </w:r>
+    </w:p>
+    <w:p>
+      <w:pPr>
+        <w:spacing w:before="100" w:beforeAutospacing="1" w:after="100" w:afterAutospacing="1" w:line="240" w:lineRule="auto"/>
+        <w:outlineLvl w:val="0"/>
+        <w:rPr>
+          <w:rFonts w:eastAsia="Times New Roman"/>
+          <w:lang w:val="en-NG"/>
+        </w:rPr>
       </w:pPr>
       <w:r>
         <w:rPr>
@@ -15540,61 +15302,7 @@
           <w:bCs/>
           <w:lang w:val="en-NG"/>
         </w:rPr>
-        <w:t>Recommended Cooling Architecture</w:t>
-      </w:r>
-    </w:p>
-    <w:p>
-      <w:pPr>
-        <w:spacing w:before="100" w:beforeAutospacing="1" w:after="100" w:afterAutospacing="1" w:line="240" w:lineRule="auto"/>
-        <w:outlineLvl w:val="0"/>
-        <w:rPr>
-          <w:rFonts w:eastAsia="Times New Roman"/>
-          <w:lang w:val="en-NG"/>
-        </w:rPr>
-      </w:pPr>
-      <w:r>
-        <w:rPr>
-          <w:rFonts w:eastAsia="Times New Roman"/>
-          <w:lang w:val="en-NG"/>
-        </w:rPr>
-        <w:t>Instead of active fan-only cooling, use:</w:t>
-      </w:r>
-    </w:p>
-    <w:p>
-      <w:pPr>
-        <w:spacing w:before="100" w:beforeAutospacing="1" w:after="100" w:afterAutospacing="1" w:line="240" w:lineRule="auto"/>
-        <w:outlineLvl w:val="0"/>
-        <w:rPr>
-          <w:rFonts w:eastAsia="Times New Roman"/>
-          <w:lang w:val="en-NG"/>
-        </w:rPr>
-      </w:pPr>
-      <w:r>
-        <w:rPr>
-          <w:rFonts w:eastAsia="Times New Roman"/>
-          <w:b/>
-          <w:bCs/>
-          <w:lang w:val="en-NG"/>
-        </w:rPr>
-        <w:lastRenderedPageBreak/>
         <w:t>phase-change heat sink + heat pipe assisted passive dissipation + smart emergency micro-blower</w:t>
-      </w:r>
-    </w:p>
-    <w:p>
-      <w:pPr>
-        <w:spacing w:before="100" w:beforeAutospacing="1" w:after="100" w:afterAutospacing="1" w:line="240" w:lineRule="auto"/>
-        <w:outlineLvl w:val="0"/>
-        <w:rPr>
-          <w:rFonts w:eastAsia="Times New Roman"/>
-          <w:lang w:val="en-NG"/>
-        </w:rPr>
-      </w:pPr>
-      <w:r>
-        <w:rPr>
-          <w:rFonts w:eastAsia="Times New Roman"/>
-          <w:lang w:val="en-NG"/>
-        </w:rPr>
-        <w:t>This is much more elegant.</w:t>
       </w:r>
     </w:p>
     <w:p>
@@ -15706,6 +15414,7 @@
           <w:noProof/>
           <w:lang w:val="en-NG"/>
         </w:rPr>
+        <w:lastRenderedPageBreak/>
         <w:drawing>
           <wp:inline distT="0" distB="0" distL="0" distR="0" wp14:anchorId="5C0EC351" wp14:editId="0A8ACBD4">
             <wp:extent cx="5943600" cy="3962400"/>
@@ -15768,72 +15477,6 @@
       <w:r>
         <w:rPr>
           <w:rFonts w:eastAsia="Times New Roman"/>
-          <w:noProof/>
-          <w:lang w:val="en-NG"/>
-        </w:rPr>
-        <w:lastRenderedPageBreak/>
-        <w:drawing>
-          <wp:inline distT="0" distB="0" distL="0" distR="0" wp14:anchorId="3D67EB7E" wp14:editId="52726B4A">
-            <wp:extent cx="5943600" cy="3962400"/>
-            <wp:effectExtent l="0" t="0" r="0" b="0"/>
-            <wp:docPr id="2089150614" name="Picture 9"/>
-            <wp:cNvGraphicFramePr>
-              <a:graphicFrameLocks xmlns:a="http://schemas.openxmlformats.org/drawingml/2006/main" noChangeAspect="1"/>
-            </wp:cNvGraphicFramePr>
-            <a:graphic xmlns:a="http://schemas.openxmlformats.org/drawingml/2006/main">
-              <a:graphicData uri="http://schemas.openxmlformats.org/drawingml/2006/picture">
-                <pic:pic xmlns:pic="http://schemas.openxmlformats.org/drawingml/2006/picture">
-                  <pic:nvPicPr>
-                    <pic:cNvPr id="0" name="Picture 257"/>
-                    <pic:cNvPicPr>
-                      <a:picLocks noChangeAspect="1" noChangeArrowheads="1"/>
-                    </pic:cNvPicPr>
-                  </pic:nvPicPr>
-                  <pic:blipFill>
-                    <a:blip r:embed="rId6" cstate="print">
-                      <a:extLst>
-                        <a:ext uri="{28A0092B-C50C-407E-A947-70E740481C1C}">
-                          <a14:useLocalDpi xmlns:a14="http://schemas.microsoft.com/office/drawing/2010/main" val="0"/>
-                        </a:ext>
-                      </a:extLst>
-                    </a:blip>
-                    <a:srcRect/>
-                    <a:stretch>
-                      <a:fillRect/>
-                    </a:stretch>
-                  </pic:blipFill>
-                  <pic:spPr bwMode="auto">
-                    <a:xfrm>
-                      <a:off x="0" y="0"/>
-                      <a:ext cx="5943600" cy="3962400"/>
-                    </a:xfrm>
-                    <a:prstGeom prst="rect">
-                      <a:avLst/>
-                    </a:prstGeom>
-                    <a:noFill/>
-                    <a:ln>
-                      <a:noFill/>
-                    </a:ln>
-                  </pic:spPr>
-                </pic:pic>
-              </a:graphicData>
-            </a:graphic>
-          </wp:inline>
-        </w:drawing>
-      </w:r>
-    </w:p>
-    <w:p>
-      <w:pPr>
-        <w:spacing w:before="100" w:beforeAutospacing="1" w:after="100" w:afterAutospacing="1" w:line="240" w:lineRule="auto"/>
-        <w:outlineLvl w:val="0"/>
-        <w:rPr>
-          <w:rFonts w:eastAsia="Times New Roman"/>
-          <w:lang w:val="en-NG"/>
-        </w:rPr>
-      </w:pPr>
-      <w:r>
-        <w:rPr>
-          <w:rFonts w:eastAsia="Times New Roman"/>
           <w:lang w:val="en-NG"/>
         </w:rPr>
         <w:t>This provides zero-energy baseline cooling.</w:t>
@@ -16167,9 +15810,8 @@
           <w:rFonts w:eastAsia="Times New Roman"/>
           <w:b/>
           <w:bCs/>
-          <w:lang w:val="en-NG"/>
-        </w:rPr>
-        <w:t>Layer 3 — Intelligent Emergency Micro-Blower</w:t>
+        </w:rPr>
+        <w:t>Layer 3 — Temperature Cut-Off Control</w:t>
       </w:r>
     </w:p>
     <w:p>
@@ -16279,7 +15921,23 @@
           <w:rFonts w:eastAsia="Times New Roman"/>
           <w:lang w:val="en-NG"/>
         </w:rPr>
-        <w:t>This keeps power draw minimal.</w:t>
+        <w:t xml:space="preserve">Charging is </w:t>
+      </w:r>
+      <w:r>
+        <w:rPr>
+          <w:rFonts w:eastAsia="Times New Roman"/>
+          <w:b/>
+          <w:bCs/>
+          <w:lang w:val="en-NG"/>
+        </w:rPr>
+        <w:t>automatically interrupted</w:t>
+      </w:r>
+      <w:r>
+        <w:rPr>
+          <w:rFonts w:eastAsia="Times New Roman"/>
+          <w:lang w:val="en-NG"/>
+        </w:rPr>
+        <w:t xml:space="preserve"> when:</w:t>
       </w:r>
     </w:p>
     <w:p>
@@ -16291,13 +15949,222 @@
           <w:lang w:val="en-NG"/>
         </w:rPr>
       </w:pPr>
+      <m:oMathPara>
+        <m:oMath>
+          <m:sSub>
+            <m:sSubPr>
+              <m:ctrlPr>
+                <w:rPr>
+                  <w:rFonts w:ascii="Cambria Math" w:eastAsia="Times New Roman" w:hAnsi="Cambria Math"/>
+                  <w:lang w:val="en-NG"/>
+                </w:rPr>
+              </m:ctrlPr>
+            </m:sSubPr>
+            <m:e>
+              <m:r>
+                <w:rPr>
+                  <w:rFonts w:ascii="Cambria Math" w:eastAsia="Times New Roman" w:hAnsi="Cambria Math"/>
+                  <w:lang w:val="en-NG"/>
+                </w:rPr>
+                <m:t>T</m:t>
+              </m:r>
+            </m:e>
+            <m:sub>
+              <m:r>
+                <m:rPr>
+                  <m:nor/>
+                </m:rPr>
+                <w:rPr>
+                  <w:rFonts w:eastAsia="Times New Roman"/>
+                  <w:lang w:val="en-NG"/>
+                </w:rPr>
+                <m:t>cell</m:t>
+              </m:r>
+            </m:sub>
+          </m:sSub>
+          <m:r>
+            <w:rPr>
+              <w:rFonts w:ascii="Cambria Math" w:eastAsia="Times New Roman" w:hAnsi="Cambria Math"/>
+              <w:lang w:val="en-NG"/>
+            </w:rPr>
+            <m:t>≥</m:t>
+          </m:r>
+          <m:sSub>
+            <m:sSubPr>
+              <m:ctrlPr>
+                <w:rPr>
+                  <w:rFonts w:ascii="Cambria Math" w:eastAsia="Times New Roman" w:hAnsi="Cambria Math"/>
+                  <w:lang w:val="en-NG"/>
+                </w:rPr>
+              </m:ctrlPr>
+            </m:sSubPr>
+            <m:e>
+              <m:r>
+                <w:rPr>
+                  <w:rFonts w:ascii="Cambria Math" w:eastAsia="Times New Roman" w:hAnsi="Cambria Math"/>
+                  <w:lang w:val="en-NG"/>
+                </w:rPr>
+                <m:t>T</m:t>
+              </m:r>
+            </m:e>
+            <m:sub>
+              <m:r>
+                <m:rPr>
+                  <m:nor/>
+                </m:rPr>
+                <w:rPr>
+                  <w:rFonts w:eastAsia="Times New Roman"/>
+                  <w:lang w:val="en-NG"/>
+                </w:rPr>
+                <m:t>cool,LFP</m:t>
+              </m:r>
+            </m:sub>
+          </m:sSub>
+          <m:r>
+            <w:rPr>
+              <w:rFonts w:eastAsia="Times New Roman"/>
+              <w:lang w:val="en-NG"/>
+            </w:rPr>
+            <w:br/>
+          </m:r>
+        </m:oMath>
+      </m:oMathPara>
+    </w:p>
+    <w:p>
+      <w:pPr>
+        <w:spacing w:before="100" w:beforeAutospacing="1" w:after="100" w:afterAutospacing="1" w:line="240" w:lineRule="auto"/>
+        <w:outlineLvl w:val="0"/>
+        <w:rPr>
+          <w:rFonts w:eastAsia="Times New Roman"/>
+          <w:lang w:val="en-NG"/>
+        </w:rPr>
+      </w:pPr>
+      <w:r>
+        <w:rPr>
+          <w:rFonts w:eastAsia="Times New Roman"/>
+          <w:lang w:val="en-NG"/>
+        </w:rPr>
+        <w:t xml:space="preserve">  Threshold:</w:t>
+      </w:r>
+    </w:p>
+    <w:p>
+      <w:pPr>
+        <w:spacing w:before="100" w:beforeAutospacing="1" w:after="100" w:afterAutospacing="1" w:line="240" w:lineRule="auto"/>
+        <w:outlineLvl w:val="0"/>
+        <w:rPr>
+          <w:rFonts w:eastAsia="Times New Roman"/>
+          <w:lang w:val="en-NG"/>
+        </w:rPr>
+      </w:pPr>
+      <m:oMathPara>
+        <m:oMath>
+          <m:sSub>
+            <m:sSubPr>
+              <m:ctrlPr>
+                <w:rPr>
+                  <w:rFonts w:ascii="Cambria Math" w:eastAsia="Times New Roman" w:hAnsi="Cambria Math"/>
+                  <w:lang w:val="en-NG"/>
+                </w:rPr>
+              </m:ctrlPr>
+            </m:sSubPr>
+            <m:e>
+              <m:r>
+                <w:rPr>
+                  <w:rFonts w:ascii="Cambria Math" w:eastAsia="Times New Roman" w:hAnsi="Cambria Math"/>
+                  <w:lang w:val="en-NG"/>
+                </w:rPr>
+                <m:t>T</m:t>
+              </m:r>
+            </m:e>
+            <m:sub>
+              <m:r>
+                <m:rPr>
+                  <m:nor/>
+                </m:rPr>
+                <w:rPr>
+                  <w:rFonts w:eastAsia="Times New Roman"/>
+                  <w:lang w:val="en-NG"/>
+                </w:rPr>
+                <m:t>cool,LFP</m:t>
+              </m:r>
+            </m:sub>
+          </m:sSub>
+          <m:r>
+            <w:rPr>
+              <w:rFonts w:ascii="Cambria Math" w:eastAsia="Times New Roman" w:hAnsi="Cambria Math"/>
+              <w:lang w:val="en-NG"/>
+            </w:rPr>
+            <m:t>=</m:t>
+          </m:r>
+          <m:sSup>
+            <m:sSupPr>
+              <m:ctrlPr>
+                <w:rPr>
+                  <w:rFonts w:ascii="Cambria Math" w:eastAsia="Times New Roman" w:hAnsi="Cambria Math"/>
+                  <w:lang w:val="en-NG"/>
+                </w:rPr>
+              </m:ctrlPr>
+            </m:sSupPr>
+            <m:e>
+              <m:r>
+                <w:rPr>
+                  <w:rFonts w:ascii="Cambria Math" w:eastAsia="Times New Roman" w:hAnsi="Cambria Math"/>
+                  <w:lang w:val="en-NG"/>
+                </w:rPr>
+                <m:t>85</m:t>
+              </m:r>
+            </m:e>
+            <m:sup>
+              <m:r>
+                <w:rPr>
+                  <w:rFonts w:ascii="Cambria Math" w:eastAsia="Times New Roman" w:hAnsi="Cambria Math"/>
+                  <w:lang w:val="en-NG"/>
+                </w:rPr>
+                <m:t>∘</m:t>
+              </m:r>
+            </m:sup>
+          </m:sSup>
+          <m:r>
+            <w:rPr>
+              <w:rFonts w:ascii="Cambria Math" w:eastAsia="Times New Roman" w:hAnsi="Cambria Math"/>
+              <w:lang w:val="en-NG"/>
+            </w:rPr>
+            <m:t>C</m:t>
+          </m:r>
+          <m:r>
+            <w:rPr>
+              <w:rFonts w:eastAsia="Times New Roman"/>
+              <w:i/>
+              <w:lang w:val="en-NG"/>
+            </w:rPr>
+            <w:br/>
+          </m:r>
+        </m:oMath>
+      </m:oMathPara>
+    </w:p>
+    <w:p>
+      <w:pPr>
+        <w:spacing w:before="100" w:beforeAutospacing="1" w:after="100" w:afterAutospacing="1" w:line="240" w:lineRule="auto"/>
+        <w:outlineLvl w:val="0"/>
+        <w:rPr>
+          <w:rFonts w:eastAsia="Times New Roman"/>
+          <w:lang w:val="en-NG"/>
+        </w:rPr>
+      </w:pPr>
+      <w:r>
+        <w:rPr>
+          <w:rFonts w:eastAsia="Times New Roman"/>
+          <w:lang w:val="en-NG"/>
+        </w:rPr>
+        <w:t xml:space="preserve"> Minimizes system weight, size, and complexity while preventing thermal runaway.</w:t>
+      </w:r>
       <w:r>
         <w:rPr>
           <w:rFonts w:eastAsia="Times New Roman"/>
           <w:lang w:val="en-NG"/>
         </w:rPr>
         <w:pict w14:anchorId="497E9FC9">
-          <v:rect id="_x0000_i1048" style="width:0;height:1.5pt" o:hralign="center" o:hrstd="t" o:hr="t" fillcolor="#a0a0a0" stroked="f"/>
+          <v:rect id="_x0000_i1069" style="width:0;height:1.5pt" o:hralign="center" o:hrstd="t" o:hr="t" fillcolor="#a0a0a0" stroked="f"/>
         </w:pict>
       </w:r>
     </w:p>
@@ -16355,7 +16222,14 @@
               <w:rFonts w:ascii="Cambria Math" w:eastAsia="Times New Roman" w:hAnsi="Cambria Math"/>
               <w:lang w:val="en-NG"/>
             </w:rPr>
-            <m:t>35</m:t>
+            <m:t>6</m:t>
+          </m:r>
+          <m:r>
+            <w:rPr>
+              <w:rFonts w:ascii="Cambria Math" w:eastAsia="Times New Roman" w:hAnsi="Cambria Math"/>
+              <w:lang w:val="en-NG"/>
+            </w:rPr>
+            <m:t>5</m:t>
           </m:r>
           <m:r>
             <m:rPr>
@@ -16382,7 +16256,14 @@
                   <w:rFonts w:ascii="Cambria Math" w:eastAsia="Times New Roman" w:hAnsi="Cambria Math"/>
                   <w:lang w:val="en-NG"/>
                 </w:rPr>
-                <m:t>40</m:t>
+                <m:t>7</m:t>
+              </m:r>
+              <m:r>
+                <w:rPr>
+                  <w:rFonts w:ascii="Cambria Math" w:eastAsia="Times New Roman" w:hAnsi="Cambria Math"/>
+                  <w:lang w:val="en-NG"/>
+                </w:rPr>
+                <m:t>0</m:t>
               </m:r>
             </m:e>
             <m:sup>
@@ -16503,7 +16384,7 @@
                       <w:rFonts w:ascii="Cambria Math" w:eastAsia="Times New Roman" w:hAnsi="Cambria Math"/>
                       <w:lang w:val="en-NG"/>
                     </w:rPr>
-                    <m:t>38</m:t>
+                    <m:t>85</m:t>
                   </m:r>
                 </m:e>
                 <m:sup>
@@ -16552,23 +16433,6 @@
           <w:rFonts w:eastAsia="Times New Roman"/>
           <w:lang w:val="en-NG"/>
         </w:rPr>
-        <w:t>This is realistic.</w:t>
-      </w:r>
-    </w:p>
-    <w:p>
-      <w:pPr>
-        <w:spacing w:before="100" w:beforeAutospacing="1" w:after="100" w:afterAutospacing="1" w:line="240" w:lineRule="auto"/>
-        <w:outlineLvl w:val="0"/>
-        <w:rPr>
-          <w:rFonts w:eastAsia="Times New Roman"/>
-          <w:lang w:val="en-NG"/>
-        </w:rPr>
-      </w:pPr>
-      <w:r>
-        <w:rPr>
-          <w:rFonts w:eastAsia="Times New Roman"/>
-          <w:lang w:val="en-NG"/>
-        </w:rPr>
         <w:pict w14:anchorId="19C4C2C1">
           <v:rect id="_x0000_i1049" style="width:0;height:1.5pt" o:hralign="center" o:hrstd="t" o:hr="t" fillcolor="#a0a0a0" stroked="f"/>
         </w:pict>
@@ -16626,6 +16490,7 @@
           <w:rFonts w:eastAsia="Times New Roman"/>
           <w:lang w:val="en-NG"/>
         </w:rPr>
+        <w:lastRenderedPageBreak/>
         <w:pict w14:anchorId="2C702CB2">
           <v:rect id="_x0000_i1050" style="width:0;height:1.5pt" o:hralign="center" o:hrstd="t" o:hr="t" fillcolor="#a0a0a0" stroked="f"/>
         </w:pict>
@@ -16712,7 +16577,6 @@
           <w:rFonts w:eastAsia="Times New Roman"/>
           <w:lang w:val="en-NG"/>
         </w:rPr>
-        <w:lastRenderedPageBreak/>
         <w:pict w14:anchorId="666F868C">
           <v:rect id="_x0000_i1051" style="width:0;height:1.5pt" o:hralign="center" o:hrstd="t" o:hr="t" fillcolor="#a0a0a0" stroked="f"/>
         </w:pict>
@@ -17198,6 +17062,7 @@
               <w:rFonts w:ascii="Cambria Math" w:eastAsia="Times New Roman" w:hAnsi="Cambria Math"/>
               <w:lang w:val="en-NG"/>
             </w:rPr>
+            <w:lastRenderedPageBreak/>
             <m:t>I=</m:t>
           </m:r>
           <m:f>
@@ -17723,6 +17588,13 @@
           <w:lang w:val="en-NG"/>
         </w:rPr>
         <w:br/>
+      </w:r>
+      <w:r>
+        <w:rPr>
+          <w:rFonts w:eastAsia="Times New Roman"/>
+          <w:lang w:val="en-NG"/>
+        </w:rPr>
+        <w:lastRenderedPageBreak/>
         <w:t>16S1P</w:t>
       </w:r>
       <w:r>
@@ -17808,7 +17680,21 @@
           <w:rFonts w:eastAsia="Times New Roman"/>
           <w:lang w:val="en-NG"/>
         </w:rPr>
-        <w:t xml:space="preserve"> = 38°C</w:t>
+        <w:t xml:space="preserve"> = </w:t>
+      </w:r>
+      <w:r>
+        <w:rPr>
+          <w:rFonts w:eastAsia="Times New Roman"/>
+          <w:lang w:val="en-NG"/>
+        </w:rPr>
+        <w:t>85</w:t>
+      </w:r>
+      <w:r>
+        <w:rPr>
+          <w:rFonts w:eastAsia="Times New Roman"/>
+          <w:lang w:val="en-NG"/>
+        </w:rPr>
+        <w:t>°C</w:t>
       </w:r>
       <w:r>
         <w:rPr>
@@ -17816,22 +17702,7 @@
           <w:lang w:val="en-NG"/>
         </w:rPr>
         <w:br/>
-        <w:t>Cooling = PCM + heat pipe + emergency micro-blower</w:t>
-      </w:r>
-      <w:r>
-        <w:rPr>
-          <w:rFonts w:eastAsia="Times New Roman"/>
-          <w:lang w:val="en-NG"/>
-        </w:rPr>
-        <w:br/>
-      </w:r>
-      <w:r>
-        <w:rPr>
-          <w:rFonts w:eastAsia="Times New Roman"/>
-          <w:lang w:val="en-NG"/>
-        </w:rPr>
-        <w:lastRenderedPageBreak/>
-        <w:t>Installation = residential solar-inverter ESS</w:t>
+        <w:t>Cooling = PCM + heat pipe = residential solar-inverter ESS</w:t>
       </w:r>
       <w:r>
         <w:rPr>
@@ -18504,6 +18375,7 @@
           <w:rFonts w:eastAsia="Times New Roman"/>
           <w:lang w:val="en-NG"/>
         </w:rPr>
+        <w:lastRenderedPageBreak/>
         <w:t>This gives you real values for blackout frequency and duration to use in your weighting functions.</w:t>
       </w:r>
     </w:p>
@@ -18544,7 +18416,6 @@
           <w:bCs/>
           <w:lang w:val="en-NG"/>
         </w:rPr>
-        <w:lastRenderedPageBreak/>
         <w:t>📌</w:t>
       </w:r>
       <w:r>
@@ -18920,6 +18791,9 @@
             <m:t>Hz</m:t>
           </m:r>
           <m:r>
+            <m:rPr>
+              <m:sty m:val="p"/>
+            </m:rPr>
             <w:rPr>
               <w:rFonts w:eastAsia="Times New Roman"/>
               <w:lang w:val="en-NG"/>
@@ -19015,6 +18889,9 @@
             <m:t>)</m:t>
           </m:r>
           <m:r>
+            <m:rPr>
+              <m:sty m:val="p"/>
+            </m:rPr>
             <w:rPr>
               <w:rFonts w:eastAsia="Times New Roman"/>
               <w:lang w:val="en-NG"/>
@@ -19531,6 +19408,9 @@
             <m:t>=0.5(11)+2.0(0.97)+10(1)=5.5+1.94+10=17.44</m:t>
           </m:r>
           <m:r>
+            <m:rPr>
+              <m:sty m:val="p"/>
+            </m:rPr>
             <w:rPr>
               <w:rFonts w:eastAsia="Times New Roman"/>
               <w:lang w:val="en-NG"/>
@@ -19585,7 +19465,6 @@
           <w:rFonts w:eastAsia="Times New Roman"/>
           <w:lang w:val="en-NG"/>
         </w:rPr>
-        <w:lastRenderedPageBreak/>
         <w:t>(where grid stays up but has large PQ deviations)</w:t>
       </w:r>
     </w:p>
@@ -19639,6 +19518,9 @@
             <m:t>=0.5(11)+2.0(0.97)+0=5.5+1.94=7.44</m:t>
           </m:r>
           <m:r>
+            <m:rPr>
+              <m:sty m:val="p"/>
+            </m:rPr>
             <w:rPr>
               <w:rFonts w:eastAsia="Times New Roman"/>
               <w:lang w:val="en-NG"/>
@@ -20136,6 +20018,9 @@
             <m:t>≈10.75</m:t>
           </m:r>
           <m:r>
+            <m:rPr>
+              <m:sty m:val="p"/>
+            </m:rPr>
             <w:rPr>
               <w:rFonts w:eastAsia="Times New Roman"/>
               <w:lang w:val="en-NG"/>
@@ -27206,7 +27091,6 @@
   <w:style w:type="character" w:default="1" w:styleId="DefaultParagraphFont">
     <w:name w:val="Default Paragraph Font"/>
     <w:uiPriority w:val="1"/>
-    <w:semiHidden/>
     <w:unhideWhenUsed/>
   </w:style>
   <w:style w:type="table" w:default="1" w:styleId="TableNormal">

</xml_diff>

<commit_message>
chore: moved optimization piece to the correct section
</commit_message>
<xml_diff>
--- a/docs/Research Paper.docx
+++ b/docs/Research Paper.docx
@@ -2064,10 +2064,323 @@
     <w:p>
       <w:pPr>
         <w:spacing w:before="100" w:beforeAutospacing="1" w:after="100" w:afterAutospacing="1" w:line="240" w:lineRule="auto"/>
-        <w:ind w:left="720"/>
-        <w:outlineLvl w:val="0"/>
-        <w:rPr>
-          <w:rFonts w:eastAsia="Times New Roman"/>
+        <w:outlineLvl w:val="2"/>
+        <w:rPr>
+          <w:rFonts w:eastAsia="Times New Roman"/>
+          <w:b/>
+          <w:bCs/>
+          <w:lang w:val="en-NG"/>
+        </w:rPr>
+      </w:pPr>
+      <w:r>
+        <w:rPr>
+          <w:rFonts w:eastAsia="Times New Roman"/>
+          <w:b/>
+          <w:bCs/>
+          <w:lang w:val="en-NG"/>
+        </w:rPr>
+        <w:t>Base Model</w:t>
+      </w:r>
+    </w:p>
+    <w:p>
+      <w:pPr>
+        <w:spacing w:before="100" w:beforeAutospacing="1" w:after="100" w:afterAutospacing="1" w:line="240" w:lineRule="auto"/>
+        <w:outlineLvl w:val="2"/>
+        <w:rPr>
+          <w:rFonts w:eastAsia="Times New Roman"/>
+          <w:b/>
+          <w:bCs/>
+          <w:lang w:val="en-NG"/>
+        </w:rPr>
+      </w:pPr>
+      <w:r>
+        <w:rPr>
+          <w:rFonts w:eastAsia="Times New Roman"/>
+          <w:b/>
+          <w:bCs/>
+          <w:lang w:val="en-NG"/>
+        </w:rPr>
+        <w:t>1. DFN (Electrochemistry Core)</w:t>
+      </w:r>
+    </w:p>
+    <w:p>
+      <w:pPr>
+        <w:pStyle w:val="ListParagraph"/>
+        <w:numPr>
+          <w:ilvl w:val="0"/>
+          <w:numId w:val="92"/>
+        </w:numPr>
+        <w:spacing w:before="100" w:beforeAutospacing="1" w:after="100" w:afterAutospacing="1" w:line="240" w:lineRule="auto"/>
+        <w:outlineLvl w:val="2"/>
+        <w:rPr>
+          <w:rFonts w:eastAsia="Times New Roman"/>
+          <w:b/>
+          <w:bCs/>
+          <w:lang w:val="en-NG"/>
+        </w:rPr>
+      </w:pPr>
+      <w:r>
+        <w:rPr>
+          <w:rFonts w:eastAsia="Times New Roman"/>
+          <w:b/>
+          <w:bCs/>
+          <w:lang w:val="en-NG"/>
+        </w:rPr>
+        <w:t xml:space="preserve">Required tooling: </w:t>
+      </w:r>
+      <w:proofErr w:type="spellStart"/>
+      <w:r>
+        <w:rPr>
+          <w:rFonts w:eastAsia="Times New Roman"/>
+          <w:b/>
+          <w:bCs/>
+          <w:lang w:val="en-NG"/>
+        </w:rPr>
+        <w:t>PyBaMM</w:t>
+      </w:r>
+      <w:proofErr w:type="spellEnd"/>
+    </w:p>
+    <w:p>
+      <w:pPr>
+        <w:spacing w:before="100" w:beforeAutospacing="1" w:after="100" w:afterAutospacing="1" w:line="240" w:lineRule="auto"/>
+        <w:outlineLvl w:val="2"/>
+        <w:rPr>
+          <w:rFonts w:eastAsia="Times New Roman"/>
+          <w:b/>
+          <w:bCs/>
+          <w:lang w:val="en-NG"/>
+        </w:rPr>
+      </w:pPr>
+      <w:r>
+        <w:rPr>
+          <w:rFonts w:eastAsia="Times New Roman"/>
+          <w:b/>
+          <w:bCs/>
+          <w:lang w:val="en-NG"/>
+        </w:rPr>
+        <w:t>2. Thermal PDE Model</w:t>
+      </w:r>
+    </w:p>
+    <w:p>
+      <w:pPr>
+        <w:spacing w:before="100" w:beforeAutospacing="1" w:after="100" w:afterAutospacing="1" w:line="240" w:lineRule="auto"/>
+        <w:outlineLvl w:val="2"/>
+        <w:rPr>
+          <w:rFonts w:eastAsia="Times New Roman"/>
+          <w:b/>
+          <w:bCs/>
+          <w:lang w:val="en-NG"/>
+        </w:rPr>
+      </w:pPr>
+      <w:r>
+        <w:rPr>
+          <w:rFonts w:eastAsia="Times New Roman"/>
+          <w:b/>
+          <w:bCs/>
+          <w:lang w:val="en-NG"/>
+        </w:rPr>
+        <w:t>Required tooling</w:t>
+      </w:r>
+      <w:r>
+        <w:rPr>
+          <w:rFonts w:eastAsia="Times New Roman"/>
+          <w:b/>
+          <w:bCs/>
+          <w:lang w:val="en-NG"/>
+        </w:rPr>
+        <w:t xml:space="preserve">: </w:t>
+      </w:r>
+      <w:proofErr w:type="spellStart"/>
+      <w:r>
+        <w:rPr>
+          <w:rFonts w:eastAsia="Times New Roman"/>
+          <w:b/>
+          <w:bCs/>
+          <w:lang w:val="en-NG"/>
+        </w:rPr>
+        <w:t>PyBaMM</w:t>
+      </w:r>
+      <w:proofErr w:type="spellEnd"/>
+      <w:r>
+        <w:rPr>
+          <w:rFonts w:eastAsia="Times New Roman"/>
+          <w:b/>
+          <w:bCs/>
+          <w:lang w:val="en-NG"/>
+        </w:rPr>
+        <w:t xml:space="preserve"> thermal </w:t>
+      </w:r>
+      <w:proofErr w:type="spellStart"/>
+      <w:r>
+        <w:rPr>
+          <w:rFonts w:eastAsia="Times New Roman"/>
+          <w:b/>
+          <w:bCs/>
+          <w:lang w:val="en-NG"/>
+        </w:rPr>
+        <w:t>submodel</w:t>
+      </w:r>
+      <w:proofErr w:type="spellEnd"/>
+      <w:r>
+        <w:rPr>
+          <w:rFonts w:eastAsia="Times New Roman"/>
+          <w:b/>
+          <w:bCs/>
+          <w:lang w:val="en-NG"/>
+        </w:rPr>
+        <w:t xml:space="preserve"> (lumped + 1D thermal)</w:t>
+      </w:r>
+    </w:p>
+    <w:p>
+      <w:pPr>
+        <w:spacing w:before="100" w:beforeAutospacing="1" w:after="100" w:afterAutospacing="1" w:line="240" w:lineRule="auto"/>
+        <w:outlineLvl w:val="2"/>
+        <w:rPr>
+          <w:rFonts w:eastAsia="Times New Roman"/>
+          <w:b/>
+          <w:bCs/>
+          <w:lang w:val="en-NG"/>
+        </w:rPr>
+      </w:pPr>
+      <w:r>
+        <w:rPr>
+          <w:rFonts w:eastAsia="Times New Roman"/>
+          <w:b/>
+          <w:bCs/>
+          <w:lang w:val="en-NG"/>
+        </w:rPr>
+        <w:t>3. Geometry + Electrode Structure</w:t>
+      </w:r>
+    </w:p>
+    <w:p>
+      <w:pPr>
+        <w:spacing w:before="100" w:beforeAutospacing="1" w:after="100" w:afterAutospacing="1" w:line="240" w:lineRule="auto"/>
+        <w:outlineLvl w:val="2"/>
+        <w:rPr>
+          <w:rFonts w:eastAsia="Times New Roman"/>
+          <w:b/>
+          <w:bCs/>
+          <w:lang w:val="en-NG"/>
+        </w:rPr>
+      </w:pPr>
+      <w:r>
+        <w:rPr>
+          <w:rFonts w:eastAsia="Times New Roman"/>
+          <w:b/>
+          <w:bCs/>
+          <w:lang w:val="en-NG"/>
+        </w:rPr>
+        <w:t>Required tooling</w:t>
+      </w:r>
+      <w:r>
+        <w:rPr>
+          <w:rFonts w:eastAsia="Times New Roman"/>
+          <w:b/>
+          <w:bCs/>
+          <w:lang w:val="en-NG"/>
+        </w:rPr>
+        <w:t xml:space="preserve">: </w:t>
+      </w:r>
+      <w:proofErr w:type="spellStart"/>
+      <w:r>
+        <w:rPr>
+          <w:rFonts w:eastAsia="Times New Roman"/>
+          <w:b/>
+          <w:bCs/>
+          <w:lang w:val="en-NG"/>
+        </w:rPr>
+        <w:t>PyBaMM</w:t>
+      </w:r>
+      <w:proofErr w:type="spellEnd"/>
+      <w:r>
+        <w:rPr>
+          <w:rFonts w:eastAsia="Times New Roman"/>
+          <w:b/>
+          <w:bCs/>
+          <w:lang w:val="en-NG"/>
+        </w:rPr>
+        <w:t xml:space="preserve"> geometry module</w:t>
+      </w:r>
+    </w:p>
+    <w:p>
+      <w:pPr>
+        <w:spacing w:before="100" w:beforeAutospacing="1" w:after="100" w:afterAutospacing="1" w:line="240" w:lineRule="auto"/>
+        <w:outlineLvl w:val="2"/>
+        <w:rPr>
+          <w:rFonts w:eastAsia="Times New Roman"/>
+          <w:b/>
+          <w:bCs/>
+          <w:lang w:val="en-NG"/>
+        </w:rPr>
+      </w:pPr>
+      <w:r>
+        <w:rPr>
+          <w:rFonts w:eastAsia="Times New Roman"/>
+          <w:b/>
+          <w:bCs/>
+          <w:lang w:val="en-NG"/>
+        </w:rPr>
+        <w:t>5. Interface Kinetics (Electrode–Electrolyte Coupling)</w:t>
+      </w:r>
+    </w:p>
+    <w:p>
+      <w:pPr>
+        <w:spacing w:before="100" w:beforeAutospacing="1" w:after="100" w:afterAutospacing="1" w:line="240" w:lineRule="auto"/>
+        <w:outlineLvl w:val="2"/>
+        <w:rPr>
+          <w:rFonts w:eastAsia="Times New Roman"/>
+          <w:b/>
+          <w:bCs/>
+          <w:lang w:val="en-NG"/>
+        </w:rPr>
+      </w:pPr>
+      <w:r>
+        <w:rPr>
+          <w:rFonts w:eastAsia="Times New Roman"/>
+          <w:b/>
+          <w:bCs/>
+          <w:lang w:val="en-NG"/>
+        </w:rPr>
+        <w:t>Required tooling</w:t>
+      </w:r>
+      <w:r>
+        <w:rPr>
+          <w:rFonts w:eastAsia="Times New Roman"/>
+          <w:b/>
+          <w:bCs/>
+          <w:lang w:val="en-NG"/>
+        </w:rPr>
+        <w:t xml:space="preserve">: </w:t>
+      </w:r>
+      <w:proofErr w:type="spellStart"/>
+      <w:r>
+        <w:rPr>
+          <w:rFonts w:eastAsia="Times New Roman"/>
+          <w:b/>
+          <w:bCs/>
+          <w:lang w:val="en-NG"/>
+        </w:rPr>
+        <w:t>PyBaMM</w:t>
+      </w:r>
+      <w:proofErr w:type="spellEnd"/>
+      <w:r>
+        <w:rPr>
+          <w:rFonts w:eastAsia="Times New Roman"/>
+          <w:b/>
+          <w:bCs/>
+          <w:lang w:val="en-NG"/>
+        </w:rPr>
+        <w:t xml:space="preserve"> reaction kinetics modules</w:t>
+      </w:r>
+    </w:p>
+    <w:p>
+      <w:pPr>
+        <w:spacing w:before="100" w:beforeAutospacing="1" w:after="100" w:afterAutospacing="1" w:line="240" w:lineRule="auto"/>
+        <w:outlineLvl w:val="2"/>
+        <w:rPr>
+          <w:rFonts w:eastAsia="Times New Roman"/>
+          <w:b/>
+          <w:bCs/>
           <w:lang w:val="en-NG"/>
         </w:rPr>
       </w:pPr>
@@ -2639,6 +2952,7 @@
           <w:bCs/>
           <w:lang w:val="en-NG"/>
         </w:rPr>
+        <w:lastRenderedPageBreak/>
         <w:t>1. Parameterization (Unified State Vector)</w:t>
       </w:r>
     </w:p>
@@ -3084,16 +3398,7 @@
           <w:bCs/>
           <w:lang w:val="en-NG"/>
         </w:rPr>
-        <w:t>)</w:t>
-      </w:r>
-      <w:r>
-        <w:rPr>
-          <w:rFonts w:eastAsia="Times New Roman"/>
-          <w:b/>
-          <w:bCs/>
-          <w:lang w:val="en-NG"/>
-        </w:rPr>
-        <w:t>:</w:t>
+        <w:t>):</w:t>
       </w:r>
       <w:r>
         <w:rPr>
@@ -3394,319 +3699,6 @@
           </m:sub>
         </m:sSub>
       </m:oMath>
-    </w:p>
-    <w:p>
-      <w:pPr>
-        <w:spacing w:before="100" w:beforeAutospacing="1" w:after="100" w:afterAutospacing="1" w:line="240" w:lineRule="auto"/>
-        <w:outlineLvl w:val="2"/>
-        <w:rPr>
-          <w:rFonts w:eastAsia="Times New Roman"/>
-          <w:b/>
-          <w:bCs/>
-          <w:lang w:val="en-NG"/>
-        </w:rPr>
-      </w:pPr>
-      <w:r>
-        <w:rPr>
-          <w:rFonts w:eastAsia="Times New Roman"/>
-          <w:b/>
-          <w:bCs/>
-          <w:lang w:val="en-NG"/>
-        </w:rPr>
-        <w:t>Base Model</w:t>
-      </w:r>
-    </w:p>
-    <w:p>
-      <w:pPr>
-        <w:spacing w:before="100" w:beforeAutospacing="1" w:after="100" w:afterAutospacing="1" w:line="240" w:lineRule="auto"/>
-        <w:outlineLvl w:val="2"/>
-        <w:rPr>
-          <w:rFonts w:eastAsia="Times New Roman"/>
-          <w:b/>
-          <w:bCs/>
-          <w:lang w:val="en-NG"/>
-        </w:rPr>
-      </w:pPr>
-      <w:r>
-        <w:rPr>
-          <w:rFonts w:eastAsia="Times New Roman"/>
-          <w:b/>
-          <w:bCs/>
-          <w:lang w:val="en-NG"/>
-        </w:rPr>
-        <w:t>1. DFN (Electrochemistry Core)</w:t>
-      </w:r>
-    </w:p>
-    <w:p>
-      <w:pPr>
-        <w:pStyle w:val="ListParagraph"/>
-        <w:numPr>
-          <w:ilvl w:val="0"/>
-          <w:numId w:val="92"/>
-        </w:numPr>
-        <w:spacing w:before="100" w:beforeAutospacing="1" w:after="100" w:afterAutospacing="1" w:line="240" w:lineRule="auto"/>
-        <w:outlineLvl w:val="2"/>
-        <w:rPr>
-          <w:rFonts w:eastAsia="Times New Roman"/>
-          <w:b/>
-          <w:bCs/>
-          <w:lang w:val="en-NG"/>
-        </w:rPr>
-      </w:pPr>
-      <w:r>
-        <w:rPr>
-          <w:rFonts w:eastAsia="Times New Roman"/>
-          <w:b/>
-          <w:bCs/>
-          <w:lang w:val="en-NG"/>
-        </w:rPr>
-        <w:t xml:space="preserve">Required tooling: </w:t>
-      </w:r>
-      <w:proofErr w:type="spellStart"/>
-      <w:r>
-        <w:rPr>
-          <w:rFonts w:eastAsia="Times New Roman"/>
-          <w:b/>
-          <w:bCs/>
-          <w:lang w:val="en-NG"/>
-        </w:rPr>
-        <w:t>PyBaMM</w:t>
-      </w:r>
-      <w:proofErr w:type="spellEnd"/>
-    </w:p>
-    <w:p>
-      <w:pPr>
-        <w:spacing w:before="100" w:beforeAutospacing="1" w:after="100" w:afterAutospacing="1" w:line="240" w:lineRule="auto"/>
-        <w:outlineLvl w:val="2"/>
-        <w:rPr>
-          <w:rFonts w:eastAsia="Times New Roman"/>
-          <w:b/>
-          <w:bCs/>
-          <w:lang w:val="en-NG"/>
-        </w:rPr>
-      </w:pPr>
-      <w:r>
-        <w:rPr>
-          <w:rFonts w:eastAsia="Times New Roman"/>
-          <w:b/>
-          <w:bCs/>
-          <w:lang w:val="en-NG"/>
-        </w:rPr>
-        <w:t>2. Thermal PDE Model</w:t>
-      </w:r>
-    </w:p>
-    <w:p>
-      <w:pPr>
-        <w:spacing w:before="100" w:beforeAutospacing="1" w:after="100" w:afterAutospacing="1" w:line="240" w:lineRule="auto"/>
-        <w:outlineLvl w:val="2"/>
-        <w:rPr>
-          <w:rFonts w:eastAsia="Times New Roman"/>
-          <w:b/>
-          <w:bCs/>
-          <w:lang w:val="en-NG"/>
-        </w:rPr>
-      </w:pPr>
-      <w:r>
-        <w:rPr>
-          <w:rFonts w:eastAsia="Times New Roman"/>
-          <w:b/>
-          <w:bCs/>
-          <w:lang w:val="en-NG"/>
-        </w:rPr>
-        <w:t>Required tooling</w:t>
-      </w:r>
-      <w:r>
-        <w:rPr>
-          <w:rFonts w:eastAsia="Times New Roman"/>
-          <w:b/>
-          <w:bCs/>
-          <w:lang w:val="en-NG"/>
-        </w:rPr>
-        <w:t xml:space="preserve">: </w:t>
-      </w:r>
-      <w:proofErr w:type="spellStart"/>
-      <w:r>
-        <w:rPr>
-          <w:rFonts w:eastAsia="Times New Roman"/>
-          <w:b/>
-          <w:bCs/>
-          <w:lang w:val="en-NG"/>
-        </w:rPr>
-        <w:t>PyBaMM</w:t>
-      </w:r>
-      <w:proofErr w:type="spellEnd"/>
-      <w:r>
-        <w:rPr>
-          <w:rFonts w:eastAsia="Times New Roman"/>
-          <w:b/>
-          <w:bCs/>
-          <w:lang w:val="en-NG"/>
-        </w:rPr>
-        <w:t xml:space="preserve"> thermal </w:t>
-      </w:r>
-      <w:proofErr w:type="spellStart"/>
-      <w:r>
-        <w:rPr>
-          <w:rFonts w:eastAsia="Times New Roman"/>
-          <w:b/>
-          <w:bCs/>
-          <w:lang w:val="en-NG"/>
-        </w:rPr>
-        <w:t>submodel</w:t>
-      </w:r>
-      <w:proofErr w:type="spellEnd"/>
-      <w:r>
-        <w:rPr>
-          <w:rFonts w:eastAsia="Times New Roman"/>
-          <w:b/>
-          <w:bCs/>
-          <w:lang w:val="en-NG"/>
-        </w:rPr>
-        <w:t xml:space="preserve"> (lumped + 1D thermal)</w:t>
-      </w:r>
-    </w:p>
-    <w:p>
-      <w:pPr>
-        <w:spacing w:before="100" w:beforeAutospacing="1" w:after="100" w:afterAutospacing="1" w:line="240" w:lineRule="auto"/>
-        <w:outlineLvl w:val="2"/>
-        <w:rPr>
-          <w:rFonts w:eastAsia="Times New Roman"/>
-          <w:b/>
-          <w:bCs/>
-          <w:lang w:val="en-NG"/>
-        </w:rPr>
-      </w:pPr>
-      <w:r>
-        <w:rPr>
-          <w:rFonts w:eastAsia="Times New Roman"/>
-          <w:b/>
-          <w:bCs/>
-          <w:lang w:val="en-NG"/>
-        </w:rPr>
-        <w:lastRenderedPageBreak/>
-        <w:t>3. Geometry + Electrode Structure</w:t>
-      </w:r>
-    </w:p>
-    <w:p>
-      <w:pPr>
-        <w:spacing w:before="100" w:beforeAutospacing="1" w:after="100" w:afterAutospacing="1" w:line="240" w:lineRule="auto"/>
-        <w:outlineLvl w:val="2"/>
-        <w:rPr>
-          <w:rFonts w:eastAsia="Times New Roman"/>
-          <w:b/>
-          <w:bCs/>
-          <w:lang w:val="en-NG"/>
-        </w:rPr>
-      </w:pPr>
-      <w:r>
-        <w:rPr>
-          <w:rFonts w:eastAsia="Times New Roman"/>
-          <w:b/>
-          <w:bCs/>
-          <w:lang w:val="en-NG"/>
-        </w:rPr>
-        <w:t>Required tooling</w:t>
-      </w:r>
-      <w:r>
-        <w:rPr>
-          <w:rFonts w:eastAsia="Times New Roman"/>
-          <w:b/>
-          <w:bCs/>
-          <w:lang w:val="en-NG"/>
-        </w:rPr>
-        <w:t xml:space="preserve">: </w:t>
-      </w:r>
-      <w:proofErr w:type="spellStart"/>
-      <w:r>
-        <w:rPr>
-          <w:rFonts w:eastAsia="Times New Roman"/>
-          <w:b/>
-          <w:bCs/>
-          <w:lang w:val="en-NG"/>
-        </w:rPr>
-        <w:t>PyBaMM</w:t>
-      </w:r>
-      <w:proofErr w:type="spellEnd"/>
-      <w:r>
-        <w:rPr>
-          <w:rFonts w:eastAsia="Times New Roman"/>
-          <w:b/>
-          <w:bCs/>
-          <w:lang w:val="en-NG"/>
-        </w:rPr>
-        <w:t xml:space="preserve"> geometry module</w:t>
-      </w:r>
-    </w:p>
-    <w:p>
-      <w:pPr>
-        <w:spacing w:before="100" w:beforeAutospacing="1" w:after="100" w:afterAutospacing="1" w:line="240" w:lineRule="auto"/>
-        <w:outlineLvl w:val="2"/>
-        <w:rPr>
-          <w:rFonts w:eastAsia="Times New Roman"/>
-          <w:b/>
-          <w:bCs/>
-          <w:lang w:val="en-NG"/>
-        </w:rPr>
-      </w:pPr>
-      <w:r>
-        <w:rPr>
-          <w:rFonts w:eastAsia="Times New Roman"/>
-          <w:b/>
-          <w:bCs/>
-          <w:lang w:val="en-NG"/>
-        </w:rPr>
-        <w:t>5. Interface Kinetics (Electrode–Electrolyte Coupling)</w:t>
-      </w:r>
-    </w:p>
-    <w:p>
-      <w:pPr>
-        <w:spacing w:before="100" w:beforeAutospacing="1" w:after="100" w:afterAutospacing="1" w:line="240" w:lineRule="auto"/>
-        <w:outlineLvl w:val="2"/>
-        <w:rPr>
-          <w:rFonts w:eastAsia="Times New Roman"/>
-          <w:b/>
-          <w:bCs/>
-          <w:lang w:val="en-NG"/>
-        </w:rPr>
-      </w:pPr>
-      <w:r>
-        <w:rPr>
-          <w:rFonts w:eastAsia="Times New Roman"/>
-          <w:b/>
-          <w:bCs/>
-          <w:lang w:val="en-NG"/>
-        </w:rPr>
-        <w:t>Required tooling</w:t>
-      </w:r>
-      <w:r>
-        <w:rPr>
-          <w:rFonts w:eastAsia="Times New Roman"/>
-          <w:b/>
-          <w:bCs/>
-          <w:lang w:val="en-NG"/>
-        </w:rPr>
-        <w:t xml:space="preserve">: </w:t>
-      </w:r>
-      <w:proofErr w:type="spellStart"/>
-      <w:r>
-        <w:rPr>
-          <w:rFonts w:eastAsia="Times New Roman"/>
-          <w:b/>
-          <w:bCs/>
-          <w:lang w:val="en-NG"/>
-        </w:rPr>
-        <w:t>PyBaMM</w:t>
-      </w:r>
-      <w:proofErr w:type="spellEnd"/>
-      <w:r>
-        <w:rPr>
-          <w:rFonts w:eastAsia="Times New Roman"/>
-          <w:b/>
-          <w:bCs/>
-          <w:lang w:val="en-NG"/>
-        </w:rPr>
-        <w:t xml:space="preserve"> reaction kinetics modules</w:t>
-      </w:r>
     </w:p>
     <w:p>
       <w:pPr>
@@ -5640,7 +5632,6 @@
           <w:bCs/>
           <w:lang w:val="en-NG"/>
         </w:rPr>
-        <w:lastRenderedPageBreak/>
         <w:t>This defines a performance manifold embedded in the reduced parameter space.</w:t>
       </w:r>
     </w:p>
@@ -5662,6 +5653,7 @@
           <w:bCs/>
           <w:lang w:val="en-NG"/>
         </w:rPr>
+        <w:lastRenderedPageBreak/>
         <w:t>2</w:t>
       </w:r>
       <w:r>
@@ -7792,6 +7784,7 @@
         <w:outlineLvl w:val="2"/>
       </w:pPr>
       <w:r>
+        <w:lastRenderedPageBreak/>
         <w:t>5. BMS Design</w:t>
       </w:r>
     </w:p>
@@ -8832,7 +8825,6 @@
           <w:bCs/>
           <w:lang w:val="en-NG"/>
         </w:rPr>
-        <w:lastRenderedPageBreak/>
         <w:t>BMS CONTROL SYSTEM + ESS SIMSCAPE ELECTRICAL MODEL</w:t>
       </w:r>
     </w:p>
@@ -8854,6 +8846,7 @@
           <w:bCs/>
           <w:lang w:val="en-NG"/>
         </w:rPr>
+        <w:lastRenderedPageBreak/>
         <w:t>The ESS is a constrained nonlinear plant:</w:t>
       </w:r>
       <m:oMath>
@@ -9381,10 +9374,11 @@
             </m:e>
           </m:d>
           <m:r>
+            <m:rPr>
+              <m:sty m:val="b"/>
+            </m:rPr>
             <w:rPr>
               <w:rFonts w:eastAsia="Times New Roman"/>
-              <w:b/>
-              <w:bCs/>
               <w:lang w:val="en-NG"/>
             </w:rPr>
             <w:br/>
@@ -9783,10 +9777,11 @@
             </m:sub>
           </m:sSub>
           <m:r>
+            <m:rPr>
+              <m:sty m:val="b"/>
+            </m:rPr>
             <w:rPr>
               <w:rFonts w:eastAsia="Times New Roman"/>
-              <w:b/>
-              <w:bCs/>
               <w:lang w:val="en-NG"/>
             </w:rPr>
             <w:br/>
@@ -11212,7 +11207,6 @@
           <w:bCs/>
           <w:lang w:val="en-NG"/>
         </w:rPr>
-        <w:lastRenderedPageBreak/>
         <w:t>4. CELL EQUALIZER CONTROLLER (FOR PACK</w:t>
       </w:r>
       <w:r>
@@ -11243,6 +11237,7 @@
           <w:bCs/>
           <w:lang w:val="en-NG"/>
         </w:rPr>
+        <w:lastRenderedPageBreak/>
         <w:t>Objective</w:t>
       </w:r>
     </w:p>
@@ -12827,10 +12822,11 @@
             </m:e>
           </m:borderBox>
           <m:r>
+            <m:rPr>
+              <m:sty m:val="b"/>
+            </m:rPr>
             <w:rPr>
               <w:rFonts w:eastAsia="Times New Roman"/>
-              <w:b/>
-              <w:bCs/>
               <w:lang w:val="en-NG"/>
             </w:rPr>
             <w:br/>
@@ -12892,7 +12888,6 @@
           <w:bCs/>
           <w:lang w:val="en-NG"/>
         </w:rPr>
-        <w:lastRenderedPageBreak/>
         <w:t>Control layers</w:t>
       </w:r>
     </w:p>
@@ -12941,6 +12936,7 @@
                 <w:bCs/>
                 <w:lang w:val="en-NG"/>
               </w:rPr>
+              <w:lastRenderedPageBreak/>
               <w:t>Layer</w:t>
             </w:r>
           </w:p>
@@ -28649,6 +28645,7 @@
   <w:style w:type="character" w:default="1" w:styleId="DefaultParagraphFont">
     <w:name w:val="Default Paragraph Font"/>
     <w:uiPriority w:val="1"/>
+    <w:semiHidden/>
     <w:unhideWhenUsed/>
   </w:style>
   <w:style w:type="table" w:default="1" w:styleId="TableNormal">

</xml_diff>

<commit_message>
fix: replace simscape with simulink
</commit_message>
<xml_diff>
--- a/docs/Research Paper.docx
+++ b/docs/Research Paper.docx
@@ -4479,6 +4479,9 @@
             <m:t>⊂θ</m:t>
           </m:r>
           <m:r>
+            <m:rPr>
+              <m:sty m:val="p"/>
+            </m:rPr>
             <w:rPr>
               <w:rFonts w:eastAsia="Times New Roman"/>
               <w:lang w:val="en-NG"/>
@@ -5908,7 +5911,28 @@
           <w:rFonts w:eastAsia="Times New Roman"/>
           <w:lang w:val="en-NG"/>
         </w:rPr>
-        <w:t>BMS CONTROL SYSTEM + ESS SIMSCAPE ELECTRICAL MODEL</w:t>
+        <w:t>S</w:t>
+      </w:r>
+      <w:r>
+        <w:rPr>
+          <w:rFonts w:eastAsia="Times New Roman"/>
+          <w:lang w:val="en-NG"/>
+        </w:rPr>
+        <w:t>IMULINK</w:t>
+      </w:r>
+      <w:r>
+        <w:rPr>
+          <w:rFonts w:eastAsia="Times New Roman"/>
+          <w:lang w:val="en-NG"/>
+        </w:rPr>
+        <w:t xml:space="preserve"> </w:t>
+      </w:r>
+      <w:r>
+        <w:rPr>
+          <w:rFonts w:eastAsia="Times New Roman"/>
+          <w:lang w:val="en-NG"/>
+        </w:rPr>
+        <w:t>BMS CONTROL SYSTEM MODEL</w:t>
       </w:r>
     </w:p>
     <w:p>

</xml_diff>